<commit_message>
refactor: rename Chart Dashboard folder to chart-pipeline
Renames the pipeline scripts folder from "Chart Dashboard" (with space)
to "chart-pipeline" (lowercase, hyphenated) for cleaner path handling.
Updates TechnicalOverview.docx path references accordingly.

Co-Authored-By: Claude Sonnet 4.6 <noreply@anthropic.com>
</commit_message>
<xml_diff>
--- a/Fortress2026_TechnicalOverview.docx
+++ b/Fortress2026_TechnicalOverview.docx
@@ -45,7 +45,7 @@
           <w:sz w:val="20"/>
           <w:szCs w:val="20"/>
         </w:rPr>
-        <w:t xml:space="preserve">Last updated: 5 March 2026</w:t>
+        <w:t xml:space="preserve">Last updated: 7 March 2026</w:t>
       </w:r>
     </w:p>
     <w:p>
@@ -516,6 +516,39 @@
           <w:szCs w:val="22"/>
         </w:rPr>
         <w:t xml:space="preserve">Note: Yahoo Finance returns unreliable ATH data for SWDA.L — both meta.fiftyTwoWeekHigh and all historical ranges return ~12,838 GBp (an adjusted/total-return figure) rather than the actual market price (~9,995 GBp). ATH computation has therefore been removed from the Worker entirely and is managed as a user-editable value in the dashboard.</w:t>
+      </w:r>
+    </w:p>
+    <w:p>
+      <w:pPr>
+        <w:spacing w:after="80"/>
+      </w:pPr>
+    </w:p>
+    <w:p>
+      <w:pPr>
+        <w:pStyle w:val="Heading2"/>
+      </w:pPr>
+      <w:r>
+        <w:rPr>
+          <w:rFonts w:ascii="Arial" w:cs="Arial" w:eastAsia="Arial" w:hAnsi="Arial"/>
+          <w:b/>
+          <w:bCs/>
+          <w:sz w:val="24"/>
+          <w:szCs w:val="24"/>
+        </w:rPr>
+        <w:t xml:space="preserve">2.4 Chart Dashboard (Python + GitHub Pages)</w:t>
+      </w:r>
+    </w:p>
+    <w:p>
+      <w:pPr>
+        <w:spacing w:after="120"/>
+      </w:pPr>
+      <w:r>
+        <w:rPr>
+          <w:rFonts w:ascii="Arial" w:cs="Arial" w:eastAsia="Arial" w:hAnsi="Arial"/>
+          <w:sz w:val="22"/>
+          <w:szCs w:val="22"/>
+        </w:rPr>
+        <w:t xml:space="preserve">A second dashboard provides interactive OHLCV candlestick charts for all 12 instruments across three timeframes. It is generated offline by two Python scripts and committed to the repository as portfolio_dashboard.html, served via GitHub Pages. See Section 6 for full details.</w:t>
       </w:r>
     </w:p>
     <w:p>
@@ -3077,7 +3110,447 @@
           <w:sz w:val="28"/>
           <w:szCs w:val="28"/>
         </w:rPr>
-        <w:t xml:space="preserve">6. Key Files</w:t>
+        <w:t xml:space="preserve">6. Chart Dashboard</w:t>
+      </w:r>
+    </w:p>
+    <w:p>
+      <w:pPr>
+        <w:pStyle w:val="Heading2"/>
+      </w:pPr>
+      <w:r>
+        <w:rPr>
+          <w:rFonts w:ascii="Arial" w:cs="Arial" w:eastAsia="Arial" w:hAnsi="Arial"/>
+          <w:b/>
+          <w:bCs/>
+          <w:sz w:val="24"/>
+          <w:szCs w:val="24"/>
+        </w:rPr>
+        <w:t xml:space="preserve">6.1 Architecture</w:t>
+      </w:r>
+    </w:p>
+    <w:p>
+      <w:pPr>
+        <w:spacing w:after="120"/>
+      </w:pPr>
+      <w:r>
+        <w:rPr>
+          <w:rFonts w:ascii="Arial" w:cs="Arial" w:eastAsia="Arial" w:hAnsi="Arial"/>
+          <w:sz w:val="22"/>
+          <w:szCs w:val="22"/>
+        </w:rPr>
+        <w:t xml:space="preserve">The chart dashboard is a self-contained static page (portfolio_dashboard.html) generated offline by two Python scripts and served via GitHub Pages alongside index.html. No server-side process runs at page load — all chart data is embedded as JSON in the HTML file at build time.</w:t>
+      </w:r>
+    </w:p>
+    <w:p>
+      <w:pPr>
+        <w:spacing w:after="80"/>
+        <w:ind w:left="360" w:hanging="200"/>
+      </w:pPr>
+      <w:r>
+        <w:rPr>
+          <w:rFonts w:ascii="Arial" w:cs="Arial" w:eastAsia="Arial" w:hAnsi="Arial"/>
+          <w:sz w:val="22"/>
+          <w:szCs w:val="22"/>
+        </w:rPr>
+        <w:t xml:space="preserve">•  fetch_portfolio.py — downloads OHLCV data for all instruments and intervals via the yfinance library (Yahoo Finance). Saves one CSV file per ticker/interval pair.</w:t>
+      </w:r>
+    </w:p>
+    <w:p>
+      <w:pPr>
+        <w:spacing w:after="80"/>
+        <w:ind w:left="360" w:hanging="200"/>
+      </w:pPr>
+      <w:r>
+        <w:rPr>
+          <w:rFonts w:ascii="Arial" w:cs="Arial" w:eastAsia="Arial" w:hAnsi="Arial"/>
+          <w:sz w:val="22"/>
+          <w:szCs w:val="22"/>
+        </w:rPr>
+        <w:t xml:space="preserve">•  generate_dashboard.py — reads the CSV files, computes all technical indicators, serialises the data as JSON, and renders portfolio_dashboard.html using Plotly.js for interactive charts.</w:t>
+      </w:r>
+    </w:p>
+    <w:p>
+      <w:pPr>
+        <w:spacing w:after="80"/>
+        <w:ind w:left="360" w:hanging="200"/>
+      </w:pPr>
+      <w:r>
+        <w:rPr>
+          <w:rFonts w:ascii="Arial" w:cs="Arial" w:eastAsia="Arial" w:hAnsi="Arial"/>
+          <w:sz w:val="22"/>
+          <w:szCs w:val="22"/>
+        </w:rPr>
+        <w:t xml:space="preserve">•  portfolio_config.json — drives both scripts: defines instruments, intervals, indicator default states, and output paths.</w:t>
+      </w:r>
+    </w:p>
+    <w:p>
+      <w:pPr>
+        <w:spacing w:after="80"/>
+      </w:pPr>
+    </w:p>
+    <w:p>
+      <w:pPr>
+        <w:pStyle w:val="Heading2"/>
+      </w:pPr>
+      <w:r>
+        <w:rPr>
+          <w:rFonts w:ascii="Arial" w:cs="Arial" w:eastAsia="Arial" w:hAnsi="Arial"/>
+          <w:b/>
+          <w:bCs/>
+          <w:sz w:val="24"/>
+          <w:szCs w:val="24"/>
+        </w:rPr>
+        <w:t xml:space="preserve">6.2 Instruments &amp; Intervals</w:t>
+      </w:r>
+    </w:p>
+    <w:p>
+      <w:pPr>
+        <w:spacing w:after="120"/>
+      </w:pPr>
+      <w:r>
+        <w:rPr>
+          <w:rFonts w:ascii="Arial" w:cs="Arial" w:eastAsia="Arial" w:hAnsi="Arial"/>
+          <w:sz w:val="22"/>
+          <w:szCs w:val="22"/>
+        </w:rPr>
+        <w:t xml:space="preserve">The chart dashboard covers all 12 configured instruments across three timeframes:</w:t>
+      </w:r>
+    </w:p>
+    <w:p>
+      <w:pPr>
+        <w:spacing w:after="80"/>
+        <w:ind w:left="360" w:hanging="200"/>
+      </w:pPr>
+      <w:r>
+        <w:rPr>
+          <w:rFonts w:ascii="Arial" w:cs="Arial" w:eastAsia="Arial" w:hAnsi="Arial"/>
+          <w:sz w:val="22"/>
+          <w:szCs w:val="22"/>
+        </w:rPr>
+        <w:t xml:space="preserve">•  1H — approximately 60 days of hourly bars</w:t>
+      </w:r>
+    </w:p>
+    <w:p>
+      <w:pPr>
+        <w:spacing w:after="80"/>
+        <w:ind w:left="360" w:hanging="200"/>
+      </w:pPr>
+      <w:r>
+        <w:rPr>
+          <w:rFonts w:ascii="Arial" w:cs="Arial" w:eastAsia="Arial" w:hAnsi="Arial"/>
+          <w:sz w:val="22"/>
+          <w:szCs w:val="22"/>
+        </w:rPr>
+        <w:t xml:space="preserve">•  1D — 2 years of daily bars</w:t>
+      </w:r>
+    </w:p>
+    <w:p>
+      <w:pPr>
+        <w:spacing w:after="80"/>
+        <w:ind w:left="360" w:hanging="200"/>
+      </w:pPr>
+      <w:r>
+        <w:rPr>
+          <w:rFonts w:ascii="Arial" w:cs="Arial" w:eastAsia="Arial" w:hAnsi="Arial"/>
+          <w:sz w:val="22"/>
+          <w:szCs w:val="22"/>
+        </w:rPr>
+        <w:t xml:space="preserve">•  1W — 10 years of weekly bars</w:t>
+      </w:r>
+    </w:p>
+    <w:p>
+      <w:pPr>
+        <w:spacing w:after="120"/>
+      </w:pPr>
+      <w:r>
+        <w:rPr>
+          <w:rFonts w:ascii="Arial" w:cs="Arial" w:eastAsia="Arial" w:hAnsi="Arial"/>
+          <w:sz w:val="22"/>
+          <w:szCs w:val="22"/>
+        </w:rPr>
+        <w:t xml:space="preserve">In addition to the 9 portfolio holdings, the chart also covers SWDA (macro benchmark), VIX (risk gauge), and UKOIL. UKOIL.L is delisted on Yahoo Finance for historical data; it is mapped to CRUD.L (WisdomTree Brent Crude Oil ETP), which tracks Brent Crude.</w:t>
+      </w:r>
+    </w:p>
+    <w:p>
+      <w:pPr>
+        <w:spacing w:after="80"/>
+      </w:pPr>
+    </w:p>
+    <w:p>
+      <w:pPr>
+        <w:pStyle w:val="Heading2"/>
+      </w:pPr>
+      <w:r>
+        <w:rPr>
+          <w:rFonts w:ascii="Arial" w:cs="Arial" w:eastAsia="Arial" w:hAnsi="Arial"/>
+          <w:b/>
+          <w:bCs/>
+          <w:sz w:val="24"/>
+          <w:szCs w:val="24"/>
+        </w:rPr>
+        <w:t xml:space="preserve">6.3 Chart Features</w:t>
+      </w:r>
+    </w:p>
+    <w:p>
+      <w:pPr>
+        <w:spacing w:after="120"/>
+      </w:pPr>
+      <w:r>
+        <w:rPr>
+          <w:rFonts w:ascii="Arial" w:cs="Arial" w:eastAsia="Arial" w:hAnsi="Arial"/>
+          <w:sz w:val="22"/>
+          <w:szCs w:val="22"/>
+        </w:rPr>
+        <w:t xml:space="preserve">Charts are rendered with Plotly.js in a multi-panel layout. Each chart can display:</w:t>
+      </w:r>
+    </w:p>
+    <w:p>
+      <w:pPr>
+        <w:spacing w:after="80"/>
+        <w:ind w:left="360" w:hanging="200"/>
+      </w:pPr>
+      <w:r>
+        <w:rPr>
+          <w:rFonts w:ascii="Arial" w:cs="Arial" w:eastAsia="Arial" w:hAnsi="Arial"/>
+          <w:sz w:val="22"/>
+          <w:szCs w:val="22"/>
+        </w:rPr>
+        <w:t xml:space="preserve">•  Main panel: candlestick OHLCV with SMA20, SMA50, and Bollinger Bands overlays</w:t>
+      </w:r>
+    </w:p>
+    <w:p>
+      <w:pPr>
+        <w:spacing w:after="80"/>
+        <w:ind w:left="360" w:hanging="200"/>
+      </w:pPr>
+      <w:r>
+        <w:rPr>
+          <w:rFonts w:ascii="Arial" w:cs="Arial" w:eastAsia="Arial" w:hAnsi="Arial"/>
+          <w:sz w:val="22"/>
+          <w:szCs w:val="22"/>
+        </w:rPr>
+        <w:t xml:space="preserve">•  Volume sub-panel (bar chart, default on)</w:t>
+      </w:r>
+    </w:p>
+    <w:p>
+      <w:pPr>
+        <w:spacing w:after="80"/>
+        <w:ind w:left="360" w:hanging="200"/>
+      </w:pPr>
+      <w:r>
+        <w:rPr>
+          <w:rFonts w:ascii="Arial" w:cs="Arial" w:eastAsia="Arial" w:hAnsi="Arial"/>
+          <w:sz w:val="22"/>
+          <w:szCs w:val="22"/>
+        </w:rPr>
+        <w:t xml:space="preserve">•  RSI sub-panel with 30/70 reference lines (default on)</w:t>
+      </w:r>
+    </w:p>
+    <w:p>
+      <w:pPr>
+        <w:spacing w:after="80"/>
+        <w:ind w:left="360" w:hanging="200"/>
+      </w:pPr>
+      <w:r>
+        <w:rPr>
+          <w:rFonts w:ascii="Arial" w:cs="Arial" w:eastAsia="Arial" w:hAnsi="Arial"/>
+          <w:sz w:val="22"/>
+          <w:szCs w:val="22"/>
+        </w:rPr>
+        <w:t xml:space="preserve">•  MACD sub-panel with signal line and histogram (default off)</w:t>
+      </w:r>
+    </w:p>
+    <w:p>
+      <w:pPr>
+        <w:spacing w:after="120"/>
+      </w:pPr>
+      <w:r>
+        <w:rPr>
+          <w:rFonts w:ascii="Arial" w:cs="Arial" w:eastAsia="Arial" w:hAnsi="Arial"/>
+          <w:sz w:val="22"/>
+          <w:szCs w:val="22"/>
+        </w:rPr>
+        <w:t xml:space="preserve">All indicator data is always pre-computed at build time regardless of default checkbox states, so toggles work at runtime without a page reload. The Plotly layout uses explicit y-axis domain arrays (not the grid property) to ensure sub-panels render below the price chart without overlap. scrollZoom is enabled on the chart area; spike lines on both axes provide a crosshair with live price readout.</w:t>
+      </w:r>
+    </w:p>
+    <w:p>
+      <w:pPr>
+        <w:spacing w:after="120"/>
+      </w:pPr>
+      <w:r>
+        <w:rPr>
+          <w:rFonts w:ascii="Arial" w:cs="Arial" w:eastAsia="Arial" w:hAnsi="Arial"/>
+          <w:sz w:val="22"/>
+          <w:szCs w:val="22"/>
+        </w:rPr>
+        <w:t xml:space="preserve">Deep-link navigation: the portfolio dashboard (index.html) has a CHARTS button on each instrument card that opens portfolio_dashboard.html?t=SYMBOL, automatically selecting the correct instrument.</w:t>
+      </w:r>
+    </w:p>
+    <w:p>
+      <w:pPr>
+        <w:spacing w:after="80"/>
+      </w:pPr>
+    </w:p>
+    <w:p>
+      <w:pPr>
+        <w:pStyle w:val="Heading2"/>
+      </w:pPr>
+      <w:r>
+        <w:rPr>
+          <w:rFonts w:ascii="Arial" w:cs="Arial" w:eastAsia="Arial" w:hAnsi="Arial"/>
+          <w:b/>
+          <w:bCs/>
+          <w:sz w:val="24"/>
+          <w:szCs w:val="24"/>
+        </w:rPr>
+        <w:t xml:space="preserve">6.4 Yahoo Finance Data Quality Fix</w:t>
+      </w:r>
+    </w:p>
+    <w:p>
+      <w:pPr>
+        <w:spacing w:after="120"/>
+      </w:pPr>
+      <w:r>
+        <w:rPr>
+          <w:rFonts w:ascii="Arial" w:cs="Arial" w:eastAsia="Arial" w:hAnsi="Arial"/>
+          <w:sz w:val="22"/>
+          <w:szCs w:val="22"/>
+        </w:rPr>
+        <w:t xml:space="preserve">yfinance occasionally returns mixed-unit data for LSE tickers: the majority of bars arrive in GBp (pence) and a minority arrive in GBP (pounds). After the standard ÷100 normalisation that converts GBp to GBP, the affected bars appear approximately 100× too small (or too large).</w:t>
+      </w:r>
+    </w:p>
+    <w:p>
+      <w:pPr>
+        <w:spacing w:after="120"/>
+      </w:pPr>
+      <w:r>
+        <w:rPr>
+          <w:rFonts w:ascii="Arial" w:cs="Arial" w:eastAsia="Arial" w:hAnsi="Arial"/>
+          <w:sz w:val="22"/>
+          <w:szCs w:val="22"/>
+        </w:rPr>
+        <w:t xml:space="preserve">The fix is implemented in fetch_portfolio.py as fix_scale_discontinuity(). It uses the global series median as a reference point. Any bar whose close is more than 10× away from the global median is assumed to be a unit mismatch and is multiplied or divided by 100 accordingly.</w:t>
+      </w:r>
+    </w:p>
+    <w:p>
+      <w:pPr>
+        <w:spacing w:after="120"/>
+      </w:pPr>
+      <w:r>
+        <w:rPr>
+          <w:rFonts w:ascii="Arial" w:cs="Arial" w:eastAsia="Arial" w:hAnsi="Arial"/>
+          <w:i/>
+          <w:iCs/>
+          <w:sz w:val="22"/>
+          <w:szCs w:val="22"/>
+        </w:rPr>
+        <w:t xml:space="preserve">Why global median rather than rolling median: a rolling window gets contaminated when the corrupted bars form a consecutive block (the window is temporarily dominated by bad values and fails to flag them as outliers). The global median remains in the correct range as long as fewer than 50% of bars are corrupted, which is always the case in practice.</w:t>
+      </w:r>
+    </w:p>
+    <w:p>
+      <w:pPr>
+        <w:spacing w:after="120"/>
+      </w:pPr>
+      <w:r>
+        <w:rPr>
+          <w:rFonts w:ascii="Arial" w:cs="Arial" w:eastAsia="Arial" w:hAnsi="Arial"/>
+          <w:sz w:val="22"/>
+          <w:szCs w:val="22"/>
+        </w:rPr>
+        <w:t xml:space="preserve">Instruments observed with this issue: SSLN (28 daily bars, Jan 27–Mar 5 2026), SGLN (28 daily bars, 5 weekly bars), NAVY (3 daily bars).</w:t>
+      </w:r>
+    </w:p>
+    <w:p>
+      <w:pPr>
+        <w:spacing w:after="80"/>
+      </w:pPr>
+    </w:p>
+    <w:p>
+      <w:pPr>
+        <w:pStyle w:val="Heading2"/>
+      </w:pPr>
+      <w:r>
+        <w:rPr>
+          <w:rFonts w:ascii="Arial" w:cs="Arial" w:eastAsia="Arial" w:hAnsi="Arial"/>
+          <w:b/>
+          <w:bCs/>
+          <w:sz w:val="24"/>
+          <w:szCs w:val="24"/>
+        </w:rPr>
+        <w:t xml:space="preserve">6.5 Refresh Workflow</w:t>
+      </w:r>
+    </w:p>
+    <w:p>
+      <w:pPr>
+        <w:spacing w:after="120"/>
+      </w:pPr>
+      <w:r>
+        <w:rPr>
+          <w:rFonts w:ascii="Arial" w:cs="Arial" w:eastAsia="Arial" w:hAnsi="Arial"/>
+          <w:sz w:val="22"/>
+          <w:szCs w:val="22"/>
+        </w:rPr>
+        <w:t xml:space="preserve">Run fetch_portfolio.py from the chart-pipeline directory to download fresh data and rebuild the dashboard:</w:t>
+      </w:r>
+    </w:p>
+    <w:p>
+      <w:pPr>
+        <w:spacing w:after="80"/>
+        <w:ind w:left="360"/>
+      </w:pPr>
+      <w:r>
+        <w:rPr>
+          <w:rFonts w:ascii="Courier New" w:cs="Courier New" w:eastAsia="Courier New" w:hAnsi="Courier New"/>
+          <w:sz w:val="20"/>
+          <w:szCs w:val="20"/>
+        </w:rPr>
+        <w:t xml:space="preserve">python3 fetch_portfolio.py</w:t>
+      </w:r>
+    </w:p>
+    <w:p>
+      <w:pPr>
+        <w:spacing w:after="120"/>
+      </w:pPr>
+      <w:r>
+        <w:rPr>
+          <w:rFonts w:ascii="Arial" w:cs="Arial" w:eastAsia="Arial" w:hAnsi="Arial"/>
+          <w:sz w:val="22"/>
+          <w:szCs w:val="22"/>
+        </w:rPr>
+        <w:t xml:space="preserve">This fetches all tickers at all intervals, saves CSVs to portfolio_data/, and then automatically invokes generate_dashboard.py to rebuild portfolio_dashboard.html. Commit and push portfolio_dashboard.html to deploy the updated charts to GitHub Pages.</w:t>
+      </w:r>
+    </w:p>
+    <w:p>
+      <w:pPr>
+        <w:spacing w:after="120"/>
+      </w:pPr>
+      <w:r>
+        <w:rPr>
+          <w:rFonts w:ascii="Arial" w:cs="Arial" w:eastAsia="Arial" w:hAnsi="Arial"/>
+          <w:sz w:val="22"/>
+          <w:szCs w:val="22"/>
+        </w:rPr>
+        <w:t xml:space="preserve">A GitHub Actions scheduled workflow can automate this. The workflow checks out the repo, runs fetch_portfolio.py, and commits the updated HTML and CSV files if any data changed.</w:t>
+      </w:r>
+    </w:p>
+    <w:p>
+      <w:pPr>
+        <w:spacing w:after="80"/>
+      </w:pPr>
+    </w:p>
+    <w:p>
+      <w:pPr>
+        <w:pStyle w:val="Heading1"/>
+      </w:pPr>
+      <w:r>
+        <w:rPr>
+          <w:rFonts w:ascii="Arial" w:cs="Arial" w:eastAsia="Arial" w:hAnsi="Arial"/>
+          <w:b/>
+          <w:bCs/>
+          <w:sz w:val="28"/>
+          <w:szCs w:val="28"/>
+        </w:rPr>
+        <w:t xml:space="preserve">7. Key Files</w:t>
       </w:r>
     </w:p>
     <w:tbl>
@@ -3509,12 +3982,243 @@
           </w:p>
         </w:tc>
       </w:tr>
+      <w:tr>
+        <w:tc>
+          <w:tcPr>
+            <w:tcW w:type="dxa" w:w="3200"/>
+            <w:tcBorders>
+              <w:top w:val="single" w:color="CCCCCC" w:sz="1"/>
+              <w:left w:val="single" w:color="CCCCCC" w:sz="1"/>
+              <w:bottom w:val="single" w:color="CCCCCC" w:sz="1"/>
+              <w:right w:val="single" w:color="CCCCCC" w:sz="1"/>
+            </w:tcBorders>
+            <w:shd w:fill="F5F5F5" w:val="clear"/>
+            <w:tcMar>
+              <w:top w:type="dxa" w:w="60"/>
+              <w:left w:type="dxa" w:w="100"/>
+              <w:bottom w:type="dxa" w:w="60"/>
+              <w:right w:type="dxa" w:w="100"/>
+            </w:tcMar>
+          </w:tcPr>
+          <w:p>
+            <w:r>
+              <w:rPr>
+                <w:rFonts w:ascii="Arial" w:cs="Arial" w:eastAsia="Arial" w:hAnsi="Arial"/>
+                <w:b/>
+                <w:bCs/>
+                <w:sz w:val="20"/>
+                <w:szCs w:val="20"/>
+              </w:rPr>
+              <w:t xml:space="preserve">portfolio_dashboard.html</w:t>
+            </w:r>
+          </w:p>
+        </w:tc>
+        <w:tc>
+          <w:tcPr>
+            <w:tcW w:type="dxa" w:w="6160"/>
+            <w:tcBorders>
+              <w:top w:val="single" w:color="CCCCCC" w:sz="1"/>
+              <w:left w:val="single" w:color="CCCCCC" w:sz="1"/>
+              <w:bottom w:val="single" w:color="CCCCCC" w:sz="1"/>
+              <w:right w:val="single" w:color="CCCCCC" w:sz="1"/>
+            </w:tcBorders>
+            <w:tcMar>
+              <w:top w:type="dxa" w:w="60"/>
+              <w:left w:type="dxa" w:w="100"/>
+              <w:bottom w:type="dxa" w:w="60"/>
+              <w:right w:type="dxa" w:w="100"/>
+            </w:tcMar>
+          </w:tcPr>
+          <w:p>
+            <w:r>
+              <w:rPr>
+                <w:rFonts w:ascii="Arial" w:cs="Arial" w:eastAsia="Arial" w:hAnsi="Arial"/>
+                <w:sz w:val="20"/>
+                <w:szCs w:val="20"/>
+              </w:rPr>
+              <w:t xml:space="preserve">Chart dashboard front-end. Generated by generate_dashboard.py; committed to the repo root and served via GitHub Pages.</w:t>
+            </w:r>
+          </w:p>
+        </w:tc>
+      </w:tr>
+      <w:tr>
+        <w:tc>
+          <w:tcPr>
+            <w:tcW w:type="dxa" w:w="3200"/>
+            <w:tcBorders>
+              <w:top w:val="single" w:color="CCCCCC" w:sz="1"/>
+              <w:left w:val="single" w:color="CCCCCC" w:sz="1"/>
+              <w:bottom w:val="single" w:color="CCCCCC" w:sz="1"/>
+              <w:right w:val="single" w:color="CCCCCC" w:sz="1"/>
+            </w:tcBorders>
+            <w:shd w:fill="F5F5F5" w:val="clear"/>
+            <w:tcMar>
+              <w:top w:type="dxa" w:w="60"/>
+              <w:left w:type="dxa" w:w="100"/>
+              <w:bottom w:type="dxa" w:w="60"/>
+              <w:right w:type="dxa" w:w="100"/>
+            </w:tcMar>
+          </w:tcPr>
+          <w:p>
+            <w:r>
+              <w:rPr>
+                <w:rFonts w:ascii="Arial" w:cs="Arial" w:eastAsia="Arial" w:hAnsi="Arial"/>
+                <w:b/>
+                <w:bCs/>
+                <w:sz w:val="20"/>
+                <w:szCs w:val="20"/>
+              </w:rPr>
+              <w:t xml:space="preserve">chart-pipeline/fetch_portfolio.py</w:t>
+            </w:r>
+          </w:p>
+        </w:tc>
+        <w:tc>
+          <w:tcPr>
+            <w:tcW w:type="dxa" w:w="6160"/>
+            <w:tcBorders>
+              <w:top w:val="single" w:color="CCCCCC" w:sz="1"/>
+              <w:left w:val="single" w:color="CCCCCC" w:sz="1"/>
+              <w:bottom w:val="single" w:color="CCCCCC" w:sz="1"/>
+              <w:right w:val="single" w:color="CCCCCC" w:sz="1"/>
+            </w:tcBorders>
+            <w:tcMar>
+              <w:top w:type="dxa" w:w="60"/>
+              <w:left w:type="dxa" w:w="100"/>
+              <w:bottom w:type="dxa" w:w="60"/>
+              <w:right w:type="dxa" w:w="100"/>
+            </w:tcMar>
+          </w:tcPr>
+          <w:p>
+            <w:r>
+              <w:rPr>
+                <w:rFonts w:ascii="Arial" w:cs="Arial" w:eastAsia="Arial" w:hAnsi="Arial"/>
+                <w:sz w:val="20"/>
+                <w:szCs w:val="20"/>
+              </w:rPr>
+              <w:t xml:space="preserve">Downloads OHLCV data for all instruments and intervals from Yahoo Finance via yfinance. Saves CSVs to portfolio_data/, then invokes generate_dashboard.py.</w:t>
+            </w:r>
+          </w:p>
+        </w:tc>
+      </w:tr>
+      <w:tr>
+        <w:tc>
+          <w:tcPr>
+            <w:tcW w:type="dxa" w:w="3200"/>
+            <w:tcBorders>
+              <w:top w:val="single" w:color="CCCCCC" w:sz="1"/>
+              <w:left w:val="single" w:color="CCCCCC" w:sz="1"/>
+              <w:bottom w:val="single" w:color="CCCCCC" w:sz="1"/>
+              <w:right w:val="single" w:color="CCCCCC" w:sz="1"/>
+            </w:tcBorders>
+            <w:shd w:fill="F5F5F5" w:val="clear"/>
+            <w:tcMar>
+              <w:top w:type="dxa" w:w="60"/>
+              <w:left w:type="dxa" w:w="100"/>
+              <w:bottom w:type="dxa" w:w="60"/>
+              <w:right w:type="dxa" w:w="100"/>
+            </w:tcMar>
+          </w:tcPr>
+          <w:p>
+            <w:r>
+              <w:rPr>
+                <w:rFonts w:ascii="Arial" w:cs="Arial" w:eastAsia="Arial" w:hAnsi="Arial"/>
+                <w:b/>
+                <w:bCs/>
+                <w:sz w:val="20"/>
+                <w:szCs w:val="20"/>
+              </w:rPr>
+              <w:t xml:space="preserve">chart-pipeline/generate_dashboard.py</w:t>
+            </w:r>
+          </w:p>
+        </w:tc>
+        <w:tc>
+          <w:tcPr>
+            <w:tcW w:type="dxa" w:w="6160"/>
+            <w:tcBorders>
+              <w:top w:val="single" w:color="CCCCCC" w:sz="1"/>
+              <w:left w:val="single" w:color="CCCCCC" w:sz="1"/>
+              <w:bottom w:val="single" w:color="CCCCCC" w:sz="1"/>
+              <w:right w:val="single" w:color="CCCCCC" w:sz="1"/>
+            </w:tcBorders>
+            <w:tcMar>
+              <w:top w:type="dxa" w:w="60"/>
+              <w:left w:type="dxa" w:w="100"/>
+              <w:bottom w:type="dxa" w:w="60"/>
+              <w:right w:type="dxa" w:w="100"/>
+            </w:tcMar>
+          </w:tcPr>
+          <w:p>
+            <w:r>
+              <w:rPr>
+                <w:rFonts w:ascii="Arial" w:cs="Arial" w:eastAsia="Arial" w:hAnsi="Arial"/>
+                <w:sz w:val="20"/>
+                <w:szCs w:val="20"/>
+              </w:rPr>
+              <w:t xml:space="preserve">Builds portfolio_dashboard.html from the CSV files. Computes all technical indicators (SMA, Bollinger, RSI, MACD) and embeds the data as JSON in the output HTML.</w:t>
+            </w:r>
+          </w:p>
+        </w:tc>
+      </w:tr>
+      <w:tr>
+        <w:tc>
+          <w:tcPr>
+            <w:tcW w:type="dxa" w:w="3200"/>
+            <w:tcBorders>
+              <w:top w:val="single" w:color="CCCCCC" w:sz="1"/>
+              <w:left w:val="single" w:color="CCCCCC" w:sz="1"/>
+              <w:bottom w:val="single" w:color="CCCCCC" w:sz="1"/>
+              <w:right w:val="single" w:color="CCCCCC" w:sz="1"/>
+            </w:tcBorders>
+            <w:shd w:fill="F5F5F5" w:val="clear"/>
+            <w:tcMar>
+              <w:top w:type="dxa" w:w="60"/>
+              <w:left w:type="dxa" w:w="100"/>
+              <w:bottom w:type="dxa" w:w="60"/>
+              <w:right w:type="dxa" w:w="100"/>
+            </w:tcMar>
+          </w:tcPr>
+          <w:p>
+            <w:r>
+              <w:rPr>
+                <w:rFonts w:ascii="Arial" w:cs="Arial" w:eastAsia="Arial" w:hAnsi="Arial"/>
+                <w:b/>
+                <w:bCs/>
+                <w:sz w:val="20"/>
+                <w:szCs w:val="20"/>
+              </w:rPr>
+              <w:t xml:space="preserve">chart-pipeline/portfolio_config.json</w:t>
+            </w:r>
+          </w:p>
+        </w:tc>
+        <w:tc>
+          <w:tcPr>
+            <w:tcW w:type="dxa" w:w="6160"/>
+            <w:tcBorders>
+              <w:top w:val="single" w:color="CCCCCC" w:sz="1"/>
+              <w:left w:val="single" w:color="CCCCCC" w:sz="1"/>
+              <w:bottom w:val="single" w:color="CCCCCC" w:sz="1"/>
+              <w:right w:val="single" w:color="CCCCCC" w:sz="1"/>
+            </w:tcBorders>
+            <w:tcMar>
+              <w:top w:type="dxa" w:w="60"/>
+              <w:left w:type="dxa" w:w="100"/>
+              <w:bottom w:type="dxa" w:w="60"/>
+              <w:right w:type="dxa" w:w="100"/>
+            </w:tcMar>
+          </w:tcPr>
+          <w:p>
+            <w:r>
+              <w:rPr>
+                <w:rFonts w:ascii="Arial" w:cs="Arial" w:eastAsia="Arial" w:hAnsi="Arial"/>
+                <w:sz w:val="20"/>
+                <w:szCs w:val="20"/>
+              </w:rPr>
+              <w:t xml:space="preserve">Configures the chart instruments, intervals, indicator default states, and output file paths used by both chart scripts.</w:t>
+            </w:r>
+          </w:p>
+        </w:tc>
+      </w:tr>
     </w:tbl>
-    <w:p>
-      <w:pPr>
-        <w:spacing w:after="80"/>
-      </w:pPr>
-    </w:p>
     <w:p>
       <w:pPr>
         <w:pStyle w:val="Heading1"/>
@@ -3527,7 +4231,7 @@
           <w:sz w:val="28"/>
           <w:szCs w:val="28"/>
         </w:rPr>
-        <w:t xml:space="preserve">7. Deployment</w:t>
+        <w:t xml:space="preserve">8. Deployment</w:t>
       </w:r>
     </w:p>
     <w:p>
@@ -3649,7 +4353,7 @@
           <w:sz w:val="28"/>
           <w:szCs w:val="28"/>
         </w:rPr>
-        <w:t xml:space="preserve">8. Alternatives Considered</w:t>
+        <w:t xml:space="preserve">9. Alternatives Considered</w:t>
       </w:r>
     </w:p>
     <w:tbl>
@@ -4028,7 +4732,7 @@
           <w:sz w:val="28"/>
           <w:szCs w:val="28"/>
         </w:rPr>
-        <w:t xml:space="preserve">9. Known Limitations</w:t>
+        <w:t xml:space="preserve">10. Known Limitations</w:t>
       </w:r>
     </w:p>
     <w:p>

</xml_diff>

<commit_message>
Dashboard update: buy/sell order support; CYBP trim to 67 sh; 5 sell-limit orders; total = market + cash
</commit_message>
<xml_diff>
--- a/Fortress2026_TechnicalOverview.docx
+++ b/Fortress2026_TechnicalOverview.docx
@@ -45,7 +45,7 @@
           <w:sz w:val="20"/>
           <w:szCs w:val="20"/>
         </w:rPr>
-        <w:t xml:space="preserve">Last updated: 7 March 2026</w:t>
+        <w:t>Last updated: 13 June 2026</w:t>
       </w:r>
     </w:p>
     <w:p>
@@ -166,7 +166,7 @@
           <w:sz w:val="22"/>
           <w:szCs w:val="22"/>
         </w:rPr>
-        <w:t xml:space="preserve">The page stores all state in localStorage between sessions (key: fortress2026_v6). No server-side rendering; all logic runs in the browser. Key features:</w:t>
+        <w:t>The page stores all state in localStorage between sessions (key: fortress2026_v7). No server-side rendering; all logic runs in the browser. Key features:</w:t>
       </w:r>
     </w:p>
     <w:p>
@@ -180,7 +180,7 @@
           <w:sz w:val="22"/>
           <w:szCs w:val="22"/>
         </w:rPr>
-        <w:t xml:space="preserve">•  Portfolio section: market value, pending capital, dry powder (editable inline), and total portfolio value in one panel</w:t>
+        <w:t>•  Portfolio section in one panel: market value (with book P&amp;L and daily change), pending orders (buy + sell totals, informational), cash (editable inline, seeded from the ii cash balance), and total portfolio value. Total = market value + cash; pending orders do not feed the total — a sell's shares are already counted at market value, and a buy's reserved capital already sits in cash.</w:t>
       </w:r>
     </w:p>
     <w:p>
@@ -222,7 +222,7 @@
           <w:sz w:val="22"/>
           <w:szCs w:val="22"/>
         </w:rPr>
-        <w:t xml:space="preserve">•  Pending orders always shown on each card, displaying % distance from live or avg cost price</w:t>
+        <w:t>•  Pending orders shown on each card: every order carries a buy/sell type (colour-coded side badge — blue buy, amber sell), a share count and a £ limit price, with the % gap to its trigger vs live price (or avg cost before the first fetch). Both buy (accumulation) and sell (trim / profit-take) limit orders are supported; a single instrument may hold both, bracketing the live price.</w:t>
       </w:r>
     </w:p>
     <w:p>

</xml_diff>

<commit_message>
TechnicalOverview: correct baseline (£33,859.58) and SWDA ATH default (£104.95) to match code
</commit_message>
<xml_diff>
--- a/Fortress2026_TechnicalOverview.docx
+++ b/Fortress2026_TechnicalOverview.docx
@@ -194,7 +194,7 @@
           <w:sz w:val="22"/>
           <w:szCs w:val="22"/>
         </w:rPr>
-        <w:t xml:space="preserve">•  Baseline comparison: total portfolio vs £33,734.58 (amount transferred into SIPP)</w:t>
+        <w:t>•  Baseline comparison: total portfolio vs £33,859.58 (amount transferred into SIPP)</w:t>
       </w:r>
     </w:p>
     <w:p>
@@ -278,7 +278,7 @@
           <w:sz w:val="22"/>
           <w:szCs w:val="22"/>
         </w:rPr>
-        <w:t xml:space="preserve">•  SWDA ATH: user-editable input in the macro bar, persisted in localStorage under fortress2026_swda_ath. Defaults to £99.95 (last known good value, Mar 2026). Update manually when SWDA makes a new all-time high.</w:t>
+        <w:t>•  SWDA ATH: user-editable input in the macro bar, persisted in localStorage under fortress2026_swda_ath. Defaults to £104.95 (last known good value, confirmed 14 May 2026). Update manually when SWDA makes a new all-time high.</w:t>
       </w:r>
     </w:p>
     <w:p>
@@ -2346,7 +2346,7 @@
           <w:sz w:val="22"/>
           <w:szCs w:val="22"/>
         </w:rPr>
-        <w:t xml:space="preserve">•  meta.fiftyTwoWeekHigh for SWDA.L returns ~£128.38 (12,838 GBp), not the actual ~£99.95</w:t>
+        <w:t>•  meta.fiftyTwoWeekHigh for SWDA.L returns ~£128.38 (12,838 GBp), not the actual ~£104.95</w:t>
       </w:r>
     </w:p>
     <w:p>
@@ -2450,7 +2450,7 @@
           <w:sz w:val="22"/>
           <w:szCs w:val="22"/>
         </w:rPr>
-        <w:t xml:space="preserve">•  Default/fallback value: £99.95 (verified from Interactive Investor broker data, March 2026)</w:t>
+        <w:t>•  Default/fallback value: £104.95 (verified from Interactive Investor broker data; confirmed 14 May 2026)</w:t>
       </w:r>
     </w:p>
     <w:p>

</xml_diff>